<commit_message>
Landing page overhaul, and some external page work.
</commit_message>
<xml_diff>
--- a/Module-3/White_Mod3_3.docx
+++ b/Module-3/White_Mod3_3.docx
@@ -3,11 +3,101 @@
 <w:document xmlns:wpc="http://schemas.microsoft.com/office/word/2010/wordprocessingCanvas" xmlns:cx="http://schemas.microsoft.com/office/drawing/2014/chartex" xmlns:cx1="http://schemas.microsoft.com/office/drawing/2015/9/8/chartex" xmlns:cx2="http://schemas.microsoft.com/office/drawing/2015/10/21/chartex" xmlns:cx3="http://schemas.microsoft.com/office/drawing/2016/5/9/chartex" xmlns:cx4="http://schemas.microsoft.com/office/drawing/2016/5/10/chartex" xmlns:cx5="http://schemas.microsoft.com/office/drawing/2016/5/11/chartex" xmlns:cx6="http://schemas.microsoft.com/office/drawing/2016/5/12/chartex" xmlns:cx7="http://schemas.microsoft.com/office/drawing/2016/5/13/chartex" xmlns:cx8="http://schemas.microsoft.com/office/drawing/2016/5/14/chartex" xmlns:mc="http://schemas.openxmlformats.org/markup-compatibility/2006" xmlns:aink="http://schemas.microsoft.com/office/drawing/2016/ink" xmlns:am3d="http://schemas.microsoft.com/office/drawing/2017/model3d" xmlns:o="urn:schemas-microsoft-com:office:office" xmlns:oel="http://schemas.microsoft.com/office/2019/extlst" xmlns:r="http://schemas.openxmlformats.org/officeDocument/2006/relationships" xmlns:m="http://schemas.openxmlformats.org/officeDocument/2006/math" xmlns:v="urn:schemas-microsoft-com:vml" xmlns:wp14="http://schemas.microsoft.com/office/word/2010/wordprocessingDrawing" xmlns:wp="http://schemas.openxmlformats.org/drawingml/2006/wordprocessingDrawing" xmlns:w10="urn:schemas-microsoft-com:office:word" xmlns:w="http://schemas.openxmlformats.org/wordprocessingml/2006/main" xmlns:w14="http://schemas.microsoft.com/office/word/2010/wordml" xmlns:w15="http://schemas.microsoft.com/office/word/2012/wordml" xmlns:w16cex="http://schemas.microsoft.com/office/word/2018/wordml/cex" xmlns:w16cid="http://schemas.microsoft.com/office/word/2016/wordml/cid" xmlns:w16="http://schemas.microsoft.com/office/word/2018/wordml" xmlns:w16du="http://schemas.microsoft.com/office/word/2023/wordml/word16du" xmlns:w16sdtdh="http://schemas.microsoft.com/office/word/2020/wordml/sdtdatahash" xmlns:w16sdtfl="http://schemas.microsoft.com/office/word/2024/wordml/sdtformatlock" xmlns:w16se="http://schemas.microsoft.com/office/word/2015/wordml/symex" xmlns:wpg="http://schemas.microsoft.com/office/word/2010/wordprocessingGroup" xmlns:wpi="http://schemas.microsoft.com/office/word/2010/wordprocessingInk" xmlns:wne="http://schemas.microsoft.com/office/word/2006/wordml" xmlns:wps="http://schemas.microsoft.com/office/word/2010/wordprocessingShape" mc:Ignorable="w14 w15 w16se w16cid w16 w16cex w16sdtdh w16sdtfl w16du wp14">
   <w:body>
     <w:p>
+      <w:pPr>
+        <w:spacing w:line="480" w:lineRule="auto"/>
+        <w:jc w:val="center"/>
+        <w:rPr>
+          <w:b/>
+          <w:sz w:val="32"/>
+        </w:rPr>
+      </w:pPr>
       <w:r>
+        <w:rPr>
+          <w:b/>
+          <w:sz w:val="32"/>
+        </w:rPr>
+        <w:t xml:space="preserve">CSD 340: Assignment 3.3 </w:t>
+      </w:r>
+      <w:r>
+        <w:rPr>
+          <w:b/>
+          <w:sz w:val="32"/>
+        </w:rPr>
+        <w:t xml:space="preserve">- </w:t>
+      </w:r>
+      <w:r>
+        <w:rPr>
+          <w:b/>
+          <w:sz w:val="32"/>
+        </w:rPr>
+        <w:t>Build a Web Page Exercise, Part 3</w:t>
+      </w:r>
+    </w:p>
+    <w:p>
+      <w:pPr>
+        <w:spacing w:line="480" w:lineRule="auto"/>
+        <w:jc w:val="center"/>
+      </w:pPr>
+      <w:r>
+        <w:t>Zachary White</w:t>
+      </w:r>
+    </w:p>
+    <w:p>
+      <w:pPr>
+        <w:spacing w:line="480" w:lineRule="auto"/>
+        <w:jc w:val="center"/>
+      </w:pPr>
+      <w:r>
+        <w:t>Sue Sampson</w:t>
+      </w:r>
+    </w:p>
+    <w:p>
+      <w:pPr>
+        <w:spacing w:line="480" w:lineRule="auto"/>
+        <w:jc w:val="center"/>
+      </w:pPr>
+      <w:r>
+        <w:t>06/14/2026</w:t>
+      </w:r>
+    </w:p>
+    <w:p>
+      <w:pPr>
+        <w:spacing w:line="480" w:lineRule="auto"/>
+        <w:jc w:val="center"/>
+      </w:pPr>
+      <w:r>
+        <w:t>CSD340</w:t>
+      </w:r>
+    </w:p>
+    <w:p>
+      <w:pPr>
+        <w:spacing w:line="480" w:lineRule="auto"/>
+        <w:jc w:val="center"/>
+      </w:pPr>
+      <w:r>
+        <w:rPr>
+          <w:noProof/>
+        </w:rPr>
         <w:drawing>
-          <wp:inline distT="0" distB="0" distL="0" distR="0" wp14:anchorId="014080C4" wp14:editId="3E5D02A6">
-            <wp:extent cx="5943600" cy="5420944"/>
-            <wp:effectExtent l="0" t="0" r="0" b="8255"/>
+          <wp:anchor distT="0" distB="0" distL="114300" distR="114300" simplePos="0" relativeHeight="251658240" behindDoc="1" locked="0" layoutInCell="1" allowOverlap="1" wp14:anchorId="014080C4" wp14:editId="52F7ACE7">
+            <wp:simplePos x="0" y="0"/>
+            <wp:positionH relativeFrom="margin">
+              <wp:posOffset>-180975</wp:posOffset>
+            </wp:positionH>
+            <wp:positionV relativeFrom="paragraph">
+              <wp:posOffset>1940560</wp:posOffset>
+            </wp:positionV>
+            <wp:extent cx="3439795" cy="3136265"/>
+            <wp:effectExtent l="0" t="0" r="8255" b="6985"/>
+            <wp:wrapTight wrapText="bothSides">
+              <wp:wrapPolygon edited="0">
+                <wp:start x="0" y="0"/>
+                <wp:lineTo x="0" y="21517"/>
+                <wp:lineTo x="21532" y="21517"/>
+                <wp:lineTo x="21532" y="0"/>
+                <wp:lineTo x="0" y="0"/>
+              </wp:wrapPolygon>
+            </wp:wrapTight>
             <wp:docPr id="1448543881" name="Picture 1"/>
             <wp:cNvGraphicFramePr>
               <a:graphicFrameLocks xmlns:a="http://schemas.openxmlformats.org/drawingml/2006/main" noChangeAspect="1"/>
@@ -20,7 +110,13 @@
                     <pic:cNvPicPr/>
                   </pic:nvPicPr>
                   <pic:blipFill>
-                    <a:blip r:embed="rId4"/>
+                    <a:blip r:embed="rId5" cstate="print">
+                      <a:extLst>
+                        <a:ext uri="{28A0092B-C50C-407E-A947-70E740481C1C}">
+                          <a14:useLocalDpi xmlns:a14="http://schemas.microsoft.com/office/drawing/2010/main" val="0"/>
+                        </a:ext>
+                      </a:extLst>
+                    </a:blip>
                     <a:stretch>
                       <a:fillRect/>
                     </a:stretch>
@@ -28,7 +124,7 @@
                   <pic:spPr>
                     <a:xfrm>
                       <a:off x="0" y="0"/>
-                      <a:ext cx="5943600" cy="5420944"/>
+                      <a:ext cx="3439795" cy="3136265"/>
                     </a:xfrm>
                     <a:prstGeom prst="rect">
                       <a:avLst/>
@@ -37,12 +133,118 @@
                 </pic:pic>
               </a:graphicData>
             </a:graphic>
-          </wp:inline>
+            <wp14:sizeRelH relativeFrom="margin">
+              <wp14:pctWidth>0</wp14:pctWidth>
+            </wp14:sizeRelH>
+            <wp14:sizeRelV relativeFrom="margin">
+              <wp14:pctHeight>0</wp14:pctHeight>
+            </wp14:sizeRelV>
+          </wp:anchor>
         </w:drawing>
+      </w:r>
+      <w:r>
         <w:drawing>
-          <wp:inline distT="0" distB="0" distL="0" distR="0" wp14:anchorId="7A7573F0" wp14:editId="00E0B9EC">
-            <wp:extent cx="5943600" cy="1962737"/>
-            <wp:effectExtent l="0" t="0" r="0" b="1905"/>
+          <wp:anchor distT="0" distB="0" distL="114300" distR="114300" simplePos="0" relativeHeight="251660288" behindDoc="1" locked="0" layoutInCell="1" allowOverlap="1" wp14:anchorId="376E4C0F" wp14:editId="391B134E">
+            <wp:simplePos x="0" y="0"/>
+            <wp:positionH relativeFrom="margin">
+              <wp:posOffset>3476773</wp:posOffset>
+            </wp:positionH>
+            <wp:positionV relativeFrom="paragraph">
+              <wp:posOffset>585455</wp:posOffset>
+            </wp:positionV>
+            <wp:extent cx="3031490" cy="4391025"/>
+            <wp:effectExtent l="0" t="0" r="0" b="9525"/>
+            <wp:wrapTight wrapText="bothSides">
+              <wp:wrapPolygon edited="0">
+                <wp:start x="0" y="0"/>
+                <wp:lineTo x="0" y="21553"/>
+                <wp:lineTo x="21446" y="21553"/>
+                <wp:lineTo x="21446" y="0"/>
+                <wp:lineTo x="0" y="0"/>
+              </wp:wrapPolygon>
+            </wp:wrapTight>
+            <wp:docPr id="47372281" name="Picture 1"/>
+            <wp:cNvGraphicFramePr>
+              <a:graphicFrameLocks xmlns:a="http://schemas.openxmlformats.org/drawingml/2006/main" noChangeAspect="1"/>
+            </wp:cNvGraphicFramePr>
+            <a:graphic xmlns:a="http://schemas.openxmlformats.org/drawingml/2006/main">
+              <a:graphicData uri="http://schemas.openxmlformats.org/drawingml/2006/picture">
+                <pic:pic xmlns:pic="http://schemas.openxmlformats.org/drawingml/2006/picture">
+                  <pic:nvPicPr>
+                    <pic:cNvPr id="47372281" name=""/>
+                    <pic:cNvPicPr/>
+                  </pic:nvPicPr>
+                  <pic:blipFill>
+                    <a:blip r:embed="rId6">
+                      <a:extLst>
+                        <a:ext uri="{28A0092B-C50C-407E-A947-70E740481C1C}">
+                          <a14:useLocalDpi xmlns:a14="http://schemas.microsoft.com/office/drawing/2010/main" val="0"/>
+                        </a:ext>
+                      </a:extLst>
+                    </a:blip>
+                    <a:stretch>
+                      <a:fillRect/>
+                    </a:stretch>
+                  </pic:blipFill>
+                  <pic:spPr>
+                    <a:xfrm>
+                      <a:off x="0" y="0"/>
+                      <a:ext cx="3031490" cy="4391025"/>
+                    </a:xfrm>
+                    <a:prstGeom prst="rect">
+                      <a:avLst/>
+                    </a:prstGeom>
+                  </pic:spPr>
+                </pic:pic>
+              </a:graphicData>
+            </a:graphic>
+            <wp14:sizeRelH relativeFrom="margin">
+              <wp14:pctWidth>0</wp14:pctWidth>
+            </wp14:sizeRelH>
+            <wp14:sizeRelV relativeFrom="margin">
+              <wp14:pctHeight>0</wp14:pctHeight>
+            </wp14:sizeRelV>
+          </wp:anchor>
+        </w:drawing>
+      </w:r>
+      <w:hyperlink r:id="rId7" w:tgtFrame="_blank" w:history="1">
+        <w:r>
+          <w:rPr>
+            <w:rStyle w:val="Hyperlink"/>
+          </w:rPr>
+          <w:t>https://devzwhite.github.io/CSD340-306J-Web-Development-with-HTML-and-2267-DD-/</w:t>
+        </w:r>
+      </w:hyperlink>
+    </w:p>
+    <w:p>
+      <w:pPr>
+        <w:spacing w:line="480" w:lineRule="auto"/>
+        <w:jc w:val="center"/>
+      </w:pPr>
+      <w:r>
+        <w:rPr>
+          <w:noProof/>
+        </w:rPr>
+        <w:drawing>
+          <wp:anchor distT="0" distB="0" distL="114300" distR="114300" simplePos="0" relativeHeight="251659264" behindDoc="1" locked="0" layoutInCell="1" allowOverlap="1" wp14:anchorId="60C0F79D" wp14:editId="3765AF02">
+            <wp:simplePos x="0" y="0"/>
+            <wp:positionH relativeFrom="margin">
+              <wp:posOffset>-180975</wp:posOffset>
+            </wp:positionH>
+            <wp:positionV relativeFrom="paragraph">
+              <wp:posOffset>101600</wp:posOffset>
+            </wp:positionV>
+            <wp:extent cx="3449320" cy="1137285"/>
+            <wp:effectExtent l="0" t="0" r="0" b="5715"/>
+            <wp:wrapTight wrapText="bothSides">
+              <wp:wrapPolygon edited="0">
+                <wp:start x="0" y="0"/>
+                <wp:lineTo x="0" y="21347"/>
+                <wp:lineTo x="21473" y="21347"/>
+                <wp:lineTo x="21473" y="0"/>
+                <wp:lineTo x="0" y="0"/>
+              </wp:wrapPolygon>
+            </wp:wrapTight>
             <wp:docPr id="531512222" name="Picture 1"/>
             <wp:cNvGraphicFramePr>
               <a:graphicFrameLocks xmlns:a="http://schemas.openxmlformats.org/drawingml/2006/main" noChangeAspect="1"/>
@@ -55,7 +257,13 @@
                     <pic:cNvPicPr/>
                   </pic:nvPicPr>
                   <pic:blipFill>
-                    <a:blip r:embed="rId5"/>
+                    <a:blip r:embed="rId8" cstate="print">
+                      <a:extLst>
+                        <a:ext uri="{28A0092B-C50C-407E-A947-70E740481C1C}">
+                          <a14:useLocalDpi xmlns:a14="http://schemas.microsoft.com/office/drawing/2010/main" val="0"/>
+                        </a:ext>
+                      </a:extLst>
+                    </a:blip>
                     <a:stretch>
                       <a:fillRect/>
                     </a:stretch>
@@ -63,7 +271,7 @@
                   <pic:spPr>
                     <a:xfrm>
                       <a:off x="0" y="0"/>
-                      <a:ext cx="5943600" cy="1962737"/>
+                      <a:ext cx="3449320" cy="1137285"/>
                     </a:xfrm>
                     <a:prstGeom prst="rect">
                       <a:avLst/>
@@ -72,47 +280,13 @@
                 </pic:pic>
               </a:graphicData>
             </a:graphic>
-          </wp:inline>
-        </w:drawing>
-      </w:r>
-    </w:p>
-    <w:p>
-      <w:r>
-        <w:lastRenderedPageBreak/>
-        <w:drawing>
-          <wp:inline distT="0" distB="0" distL="0" distR="0" wp14:anchorId="4BA1AF7A" wp14:editId="14D5C92B">
-            <wp:extent cx="5904762" cy="6800000"/>
-            <wp:effectExtent l="0" t="0" r="1270" b="1270"/>
-            <wp:docPr id="1975386136" name="Picture 1"/>
-            <wp:cNvGraphicFramePr>
-              <a:graphicFrameLocks xmlns:a="http://schemas.openxmlformats.org/drawingml/2006/main" noChangeAspect="1"/>
-            </wp:cNvGraphicFramePr>
-            <a:graphic xmlns:a="http://schemas.openxmlformats.org/drawingml/2006/main">
-              <a:graphicData uri="http://schemas.openxmlformats.org/drawingml/2006/picture">
-                <pic:pic xmlns:pic="http://schemas.openxmlformats.org/drawingml/2006/picture">
-                  <pic:nvPicPr>
-                    <pic:cNvPr id="1975386136" name=""/>
-                    <pic:cNvPicPr/>
-                  </pic:nvPicPr>
-                  <pic:blipFill>
-                    <a:blip r:embed="rId6"/>
-                    <a:stretch>
-                      <a:fillRect/>
-                    </a:stretch>
-                  </pic:blipFill>
-                  <pic:spPr>
-                    <a:xfrm>
-                      <a:off x="0" y="0"/>
-                      <a:ext cx="5904762" cy="6800000"/>
-                    </a:xfrm>
-                    <a:prstGeom prst="rect">
-                      <a:avLst/>
-                    </a:prstGeom>
-                  </pic:spPr>
-                </pic:pic>
-              </a:graphicData>
-            </a:graphic>
-          </wp:inline>
+            <wp14:sizeRelH relativeFrom="margin">
+              <wp14:pctWidth>0</wp14:pctWidth>
+            </wp14:sizeRelH>
+            <wp14:sizeRelV relativeFrom="margin">
+              <wp14:pctHeight>0</wp14:pctHeight>
+            </wp14:sizeRelV>
+          </wp:anchor>
         </w:drawing>
       </w:r>
     </w:p>
@@ -126,22 +300,781 @@
 </w:document>
 </file>
 
+<file path=word/numbering.xml><?xml version="1.0" encoding="utf-8"?>
+<w:numbering xmlns:wpc="http://schemas.microsoft.com/office/word/2010/wordprocessingCanvas" xmlns:cx="http://schemas.microsoft.com/office/drawing/2014/chartex" xmlns:cx1="http://schemas.microsoft.com/office/drawing/2015/9/8/chartex" xmlns:cx2="http://schemas.microsoft.com/office/drawing/2015/10/21/chartex" xmlns:cx3="http://schemas.microsoft.com/office/drawing/2016/5/9/chartex" xmlns:cx4="http://schemas.microsoft.com/office/drawing/2016/5/10/chartex" xmlns:cx5="http://schemas.microsoft.com/office/drawing/2016/5/11/chartex" xmlns:cx6="http://schemas.microsoft.com/office/drawing/2016/5/12/chartex" xmlns:cx7="http://schemas.microsoft.com/office/drawing/2016/5/13/chartex" xmlns:cx8="http://schemas.microsoft.com/office/drawing/2016/5/14/chartex" xmlns:mc="http://schemas.openxmlformats.org/markup-compatibility/2006" xmlns:aink="http://schemas.microsoft.com/office/drawing/2016/ink" xmlns:am3d="http://schemas.microsoft.com/office/drawing/2017/model3d" xmlns:o="urn:schemas-microsoft-com:office:office" xmlns:oel="http://schemas.microsoft.com/office/2019/extlst" xmlns:r="http://schemas.openxmlformats.org/officeDocument/2006/relationships" xmlns:m="http://schemas.openxmlformats.org/officeDocument/2006/math" xmlns:v="urn:schemas-microsoft-com:vml" xmlns:wp14="http://schemas.microsoft.com/office/word/2010/wordprocessingDrawing" xmlns:wp="http://schemas.openxmlformats.org/drawingml/2006/wordprocessingDrawing" xmlns:w10="urn:schemas-microsoft-com:office:word" xmlns:w="http://schemas.openxmlformats.org/wordprocessingml/2006/main" xmlns:w14="http://schemas.microsoft.com/office/word/2010/wordml" xmlns:w15="http://schemas.microsoft.com/office/word/2012/wordml" xmlns:w16cex="http://schemas.microsoft.com/office/word/2018/wordml/cex" xmlns:w16cid="http://schemas.microsoft.com/office/word/2016/wordml/cid" xmlns:w16="http://schemas.microsoft.com/office/word/2018/wordml" xmlns:w16du="http://schemas.microsoft.com/office/word/2023/wordml/word16du" xmlns:w16sdtdh="http://schemas.microsoft.com/office/word/2020/wordml/sdtdatahash" xmlns:w16sdtfl="http://schemas.microsoft.com/office/word/2024/wordml/sdtformatlock" xmlns:w16se="http://schemas.microsoft.com/office/word/2015/wordml/symex" xmlns:wpg="http://schemas.microsoft.com/office/word/2010/wordprocessingGroup" xmlns:wpi="http://schemas.microsoft.com/office/word/2010/wordprocessingInk" xmlns:wne="http://schemas.microsoft.com/office/word/2006/wordml" xmlns:wps="http://schemas.microsoft.com/office/word/2010/wordprocessingShape" mc:Ignorable="w14 w15 w16se w16cid w16 w16cex w16sdtdh w16sdtfl w16du wp14">
+  <w:abstractNum w:abstractNumId="0" w15:restartNumberingAfterBreak="0">
+    <w:nsid w:val="013173BE"/>
+    <w:multiLevelType w:val="hybridMultilevel"/>
+    <w:tmpl w:val="1A5CB79A"/>
+    <w:lvl w:ilvl="0" w:tplc="04090001">
+      <w:start w:val="1"/>
+      <w:numFmt w:val="bullet"/>
+      <w:lvlText w:val=""/>
+      <w:lvlJc w:val="left"/>
+      <w:pPr>
+        <w:ind w:left="720" w:hanging="360"/>
+      </w:pPr>
+      <w:rPr>
+        <w:rFonts w:ascii="Symbol" w:hAnsi="Symbol" w:hint="default"/>
+      </w:rPr>
+    </w:lvl>
+    <w:lvl w:ilvl="1" w:tplc="04090003" w:tentative="1">
+      <w:start w:val="1"/>
+      <w:numFmt w:val="bullet"/>
+      <w:lvlText w:val="o"/>
+      <w:lvlJc w:val="left"/>
+      <w:pPr>
+        <w:ind w:left="1440" w:hanging="360"/>
+      </w:pPr>
+      <w:rPr>
+        <w:rFonts w:ascii="Courier New" w:hAnsi="Courier New" w:cs="Courier New" w:hint="default"/>
+      </w:rPr>
+    </w:lvl>
+    <w:lvl w:ilvl="2" w:tplc="04090005" w:tentative="1">
+      <w:start w:val="1"/>
+      <w:numFmt w:val="bullet"/>
+      <w:lvlText w:val=""/>
+      <w:lvlJc w:val="left"/>
+      <w:pPr>
+        <w:ind w:left="2160" w:hanging="360"/>
+      </w:pPr>
+      <w:rPr>
+        <w:rFonts w:ascii="Wingdings" w:hAnsi="Wingdings" w:hint="default"/>
+      </w:rPr>
+    </w:lvl>
+    <w:lvl w:ilvl="3" w:tplc="04090001" w:tentative="1">
+      <w:start w:val="1"/>
+      <w:numFmt w:val="bullet"/>
+      <w:lvlText w:val=""/>
+      <w:lvlJc w:val="left"/>
+      <w:pPr>
+        <w:ind w:left="2880" w:hanging="360"/>
+      </w:pPr>
+      <w:rPr>
+        <w:rFonts w:ascii="Symbol" w:hAnsi="Symbol" w:hint="default"/>
+      </w:rPr>
+    </w:lvl>
+    <w:lvl w:ilvl="4" w:tplc="04090003" w:tentative="1">
+      <w:start w:val="1"/>
+      <w:numFmt w:val="bullet"/>
+      <w:lvlText w:val="o"/>
+      <w:lvlJc w:val="left"/>
+      <w:pPr>
+        <w:ind w:left="3600" w:hanging="360"/>
+      </w:pPr>
+      <w:rPr>
+        <w:rFonts w:ascii="Courier New" w:hAnsi="Courier New" w:cs="Courier New" w:hint="default"/>
+      </w:rPr>
+    </w:lvl>
+    <w:lvl w:ilvl="5" w:tplc="04090005" w:tentative="1">
+      <w:start w:val="1"/>
+      <w:numFmt w:val="bullet"/>
+      <w:lvlText w:val=""/>
+      <w:lvlJc w:val="left"/>
+      <w:pPr>
+        <w:ind w:left="4320" w:hanging="360"/>
+      </w:pPr>
+      <w:rPr>
+        <w:rFonts w:ascii="Wingdings" w:hAnsi="Wingdings" w:hint="default"/>
+      </w:rPr>
+    </w:lvl>
+    <w:lvl w:ilvl="6" w:tplc="04090001" w:tentative="1">
+      <w:start w:val="1"/>
+      <w:numFmt w:val="bullet"/>
+      <w:lvlText w:val=""/>
+      <w:lvlJc w:val="left"/>
+      <w:pPr>
+        <w:ind w:left="5040" w:hanging="360"/>
+      </w:pPr>
+      <w:rPr>
+        <w:rFonts w:ascii="Symbol" w:hAnsi="Symbol" w:hint="default"/>
+      </w:rPr>
+    </w:lvl>
+    <w:lvl w:ilvl="7" w:tplc="04090003" w:tentative="1">
+      <w:start w:val="1"/>
+      <w:numFmt w:val="bullet"/>
+      <w:lvlText w:val="o"/>
+      <w:lvlJc w:val="left"/>
+      <w:pPr>
+        <w:ind w:left="5760" w:hanging="360"/>
+      </w:pPr>
+      <w:rPr>
+        <w:rFonts w:ascii="Courier New" w:hAnsi="Courier New" w:cs="Courier New" w:hint="default"/>
+      </w:rPr>
+    </w:lvl>
+    <w:lvl w:ilvl="8" w:tplc="04090005" w:tentative="1">
+      <w:start w:val="1"/>
+      <w:numFmt w:val="bullet"/>
+      <w:lvlText w:val=""/>
+      <w:lvlJc w:val="left"/>
+      <w:pPr>
+        <w:ind w:left="6480" w:hanging="360"/>
+      </w:pPr>
+      <w:rPr>
+        <w:rFonts w:ascii="Wingdings" w:hAnsi="Wingdings" w:hint="default"/>
+      </w:rPr>
+    </w:lvl>
+  </w:abstractNum>
+  <w:abstractNum w:abstractNumId="1" w15:restartNumberingAfterBreak="0">
+    <w:nsid w:val="0B86473B"/>
+    <w:multiLevelType w:val="hybridMultilevel"/>
+    <w:tmpl w:val="BBDEBD00"/>
+    <w:lvl w:ilvl="0" w:tplc="04090001">
+      <w:start w:val="1"/>
+      <w:numFmt w:val="bullet"/>
+      <w:lvlText w:val=""/>
+      <w:lvlJc w:val="left"/>
+      <w:pPr>
+        <w:ind w:left="720" w:hanging="360"/>
+      </w:pPr>
+      <w:rPr>
+        <w:rFonts w:ascii="Symbol" w:hAnsi="Symbol" w:hint="default"/>
+      </w:rPr>
+    </w:lvl>
+    <w:lvl w:ilvl="1" w:tplc="04090003" w:tentative="1">
+      <w:start w:val="1"/>
+      <w:numFmt w:val="bullet"/>
+      <w:lvlText w:val="o"/>
+      <w:lvlJc w:val="left"/>
+      <w:pPr>
+        <w:ind w:left="1440" w:hanging="360"/>
+      </w:pPr>
+      <w:rPr>
+        <w:rFonts w:ascii="Courier New" w:hAnsi="Courier New" w:cs="Courier New" w:hint="default"/>
+      </w:rPr>
+    </w:lvl>
+    <w:lvl w:ilvl="2" w:tplc="04090005" w:tentative="1">
+      <w:start w:val="1"/>
+      <w:numFmt w:val="bullet"/>
+      <w:lvlText w:val=""/>
+      <w:lvlJc w:val="left"/>
+      <w:pPr>
+        <w:ind w:left="2160" w:hanging="360"/>
+      </w:pPr>
+      <w:rPr>
+        <w:rFonts w:ascii="Wingdings" w:hAnsi="Wingdings" w:hint="default"/>
+      </w:rPr>
+    </w:lvl>
+    <w:lvl w:ilvl="3" w:tplc="04090001" w:tentative="1">
+      <w:start w:val="1"/>
+      <w:numFmt w:val="bullet"/>
+      <w:lvlText w:val=""/>
+      <w:lvlJc w:val="left"/>
+      <w:pPr>
+        <w:ind w:left="2880" w:hanging="360"/>
+      </w:pPr>
+      <w:rPr>
+        <w:rFonts w:ascii="Symbol" w:hAnsi="Symbol" w:hint="default"/>
+      </w:rPr>
+    </w:lvl>
+    <w:lvl w:ilvl="4" w:tplc="04090003" w:tentative="1">
+      <w:start w:val="1"/>
+      <w:numFmt w:val="bullet"/>
+      <w:lvlText w:val="o"/>
+      <w:lvlJc w:val="left"/>
+      <w:pPr>
+        <w:ind w:left="3600" w:hanging="360"/>
+      </w:pPr>
+      <w:rPr>
+        <w:rFonts w:ascii="Courier New" w:hAnsi="Courier New" w:cs="Courier New" w:hint="default"/>
+      </w:rPr>
+    </w:lvl>
+    <w:lvl w:ilvl="5" w:tplc="04090005" w:tentative="1">
+      <w:start w:val="1"/>
+      <w:numFmt w:val="bullet"/>
+      <w:lvlText w:val=""/>
+      <w:lvlJc w:val="left"/>
+      <w:pPr>
+        <w:ind w:left="4320" w:hanging="360"/>
+      </w:pPr>
+      <w:rPr>
+        <w:rFonts w:ascii="Wingdings" w:hAnsi="Wingdings" w:hint="default"/>
+      </w:rPr>
+    </w:lvl>
+    <w:lvl w:ilvl="6" w:tplc="04090001" w:tentative="1">
+      <w:start w:val="1"/>
+      <w:numFmt w:val="bullet"/>
+      <w:lvlText w:val=""/>
+      <w:lvlJc w:val="left"/>
+      <w:pPr>
+        <w:ind w:left="5040" w:hanging="360"/>
+      </w:pPr>
+      <w:rPr>
+        <w:rFonts w:ascii="Symbol" w:hAnsi="Symbol" w:hint="default"/>
+      </w:rPr>
+    </w:lvl>
+    <w:lvl w:ilvl="7" w:tplc="04090003" w:tentative="1">
+      <w:start w:val="1"/>
+      <w:numFmt w:val="bullet"/>
+      <w:lvlText w:val="o"/>
+      <w:lvlJc w:val="left"/>
+      <w:pPr>
+        <w:ind w:left="5760" w:hanging="360"/>
+      </w:pPr>
+      <w:rPr>
+        <w:rFonts w:ascii="Courier New" w:hAnsi="Courier New" w:cs="Courier New" w:hint="default"/>
+      </w:rPr>
+    </w:lvl>
+    <w:lvl w:ilvl="8" w:tplc="04090005" w:tentative="1">
+      <w:start w:val="1"/>
+      <w:numFmt w:val="bullet"/>
+      <w:lvlText w:val=""/>
+      <w:lvlJc w:val="left"/>
+      <w:pPr>
+        <w:ind w:left="6480" w:hanging="360"/>
+      </w:pPr>
+      <w:rPr>
+        <w:rFonts w:ascii="Wingdings" w:hAnsi="Wingdings" w:hint="default"/>
+      </w:rPr>
+    </w:lvl>
+  </w:abstractNum>
+  <w:abstractNum w:abstractNumId="2" w15:restartNumberingAfterBreak="0">
+    <w:nsid w:val="14D270BA"/>
+    <w:multiLevelType w:val="multilevel"/>
+    <w:tmpl w:val="07AE1C62"/>
+    <w:lvl w:ilvl="0">
+      <w:start w:val="1"/>
+      <w:numFmt w:val="bullet"/>
+      <w:lvlText w:val="•"/>
+      <w:lvlJc w:val="left"/>
+      <w:pPr>
+        <w:ind w:left="720" w:hanging="360"/>
+      </w:pPr>
+      <w:rPr>
+        <w:rFonts w:ascii="Symbol" w:hAnsi="Symbol" w:hint="default"/>
+      </w:rPr>
+    </w:lvl>
+    <w:lvl w:ilvl="1">
+      <w:numFmt w:val="decimal"/>
+      <w:lvlText w:val=""/>
+      <w:lvlJc w:val="left"/>
+    </w:lvl>
+    <w:lvl w:ilvl="2">
+      <w:numFmt w:val="decimal"/>
+      <w:lvlText w:val=""/>
+      <w:lvlJc w:val="left"/>
+    </w:lvl>
+    <w:lvl w:ilvl="3">
+      <w:numFmt w:val="decimal"/>
+      <w:lvlText w:val=""/>
+      <w:lvlJc w:val="left"/>
+    </w:lvl>
+    <w:lvl w:ilvl="4">
+      <w:numFmt w:val="decimal"/>
+      <w:lvlText w:val=""/>
+      <w:lvlJc w:val="left"/>
+    </w:lvl>
+    <w:lvl w:ilvl="5">
+      <w:numFmt w:val="decimal"/>
+      <w:lvlText w:val=""/>
+      <w:lvlJc w:val="left"/>
+    </w:lvl>
+    <w:lvl w:ilvl="6">
+      <w:numFmt w:val="decimal"/>
+      <w:lvlText w:val=""/>
+      <w:lvlJc w:val="left"/>
+    </w:lvl>
+    <w:lvl w:ilvl="7">
+      <w:numFmt w:val="decimal"/>
+      <w:lvlText w:val=""/>
+      <w:lvlJc w:val="left"/>
+    </w:lvl>
+    <w:lvl w:ilvl="8">
+      <w:numFmt w:val="decimal"/>
+      <w:lvlText w:val=""/>
+      <w:lvlJc w:val="left"/>
+    </w:lvl>
+  </w:abstractNum>
+  <w:abstractNum w:abstractNumId="3" w15:restartNumberingAfterBreak="0">
+    <w:nsid w:val="25B36DF9"/>
+    <w:multiLevelType w:val="hybridMultilevel"/>
+    <w:tmpl w:val="68666D48"/>
+    <w:lvl w:ilvl="0" w:tplc="04090001">
+      <w:start w:val="1"/>
+      <w:numFmt w:val="bullet"/>
+      <w:lvlText w:val=""/>
+      <w:lvlJc w:val="left"/>
+      <w:pPr>
+        <w:ind w:left="720" w:hanging="360"/>
+      </w:pPr>
+      <w:rPr>
+        <w:rFonts w:ascii="Symbol" w:hAnsi="Symbol" w:hint="default"/>
+      </w:rPr>
+    </w:lvl>
+    <w:lvl w:ilvl="1" w:tplc="04090003" w:tentative="1">
+      <w:start w:val="1"/>
+      <w:numFmt w:val="bullet"/>
+      <w:lvlText w:val="o"/>
+      <w:lvlJc w:val="left"/>
+      <w:pPr>
+        <w:ind w:left="1440" w:hanging="360"/>
+      </w:pPr>
+      <w:rPr>
+        <w:rFonts w:ascii="Courier New" w:hAnsi="Courier New" w:cs="Courier New" w:hint="default"/>
+      </w:rPr>
+    </w:lvl>
+    <w:lvl w:ilvl="2" w:tplc="04090005" w:tentative="1">
+      <w:start w:val="1"/>
+      <w:numFmt w:val="bullet"/>
+      <w:lvlText w:val=""/>
+      <w:lvlJc w:val="left"/>
+      <w:pPr>
+        <w:ind w:left="2160" w:hanging="360"/>
+      </w:pPr>
+      <w:rPr>
+        <w:rFonts w:ascii="Wingdings" w:hAnsi="Wingdings" w:hint="default"/>
+      </w:rPr>
+    </w:lvl>
+    <w:lvl w:ilvl="3" w:tplc="04090001" w:tentative="1">
+      <w:start w:val="1"/>
+      <w:numFmt w:val="bullet"/>
+      <w:lvlText w:val=""/>
+      <w:lvlJc w:val="left"/>
+      <w:pPr>
+        <w:ind w:left="2880" w:hanging="360"/>
+      </w:pPr>
+      <w:rPr>
+        <w:rFonts w:ascii="Symbol" w:hAnsi="Symbol" w:hint="default"/>
+      </w:rPr>
+    </w:lvl>
+    <w:lvl w:ilvl="4" w:tplc="04090003" w:tentative="1">
+      <w:start w:val="1"/>
+      <w:numFmt w:val="bullet"/>
+      <w:lvlText w:val="o"/>
+      <w:lvlJc w:val="left"/>
+      <w:pPr>
+        <w:ind w:left="3600" w:hanging="360"/>
+      </w:pPr>
+      <w:rPr>
+        <w:rFonts w:ascii="Courier New" w:hAnsi="Courier New" w:cs="Courier New" w:hint="default"/>
+      </w:rPr>
+    </w:lvl>
+    <w:lvl w:ilvl="5" w:tplc="04090005" w:tentative="1">
+      <w:start w:val="1"/>
+      <w:numFmt w:val="bullet"/>
+      <w:lvlText w:val=""/>
+      <w:lvlJc w:val="left"/>
+      <w:pPr>
+        <w:ind w:left="4320" w:hanging="360"/>
+      </w:pPr>
+      <w:rPr>
+        <w:rFonts w:ascii="Wingdings" w:hAnsi="Wingdings" w:hint="default"/>
+      </w:rPr>
+    </w:lvl>
+    <w:lvl w:ilvl="6" w:tplc="04090001" w:tentative="1">
+      <w:start w:val="1"/>
+      <w:numFmt w:val="bullet"/>
+      <w:lvlText w:val=""/>
+      <w:lvlJc w:val="left"/>
+      <w:pPr>
+        <w:ind w:left="5040" w:hanging="360"/>
+      </w:pPr>
+      <w:rPr>
+        <w:rFonts w:ascii="Symbol" w:hAnsi="Symbol" w:hint="default"/>
+      </w:rPr>
+    </w:lvl>
+    <w:lvl w:ilvl="7" w:tplc="04090003" w:tentative="1">
+      <w:start w:val="1"/>
+      <w:numFmt w:val="bullet"/>
+      <w:lvlText w:val="o"/>
+      <w:lvlJc w:val="left"/>
+      <w:pPr>
+        <w:ind w:left="5760" w:hanging="360"/>
+      </w:pPr>
+      <w:rPr>
+        <w:rFonts w:ascii="Courier New" w:hAnsi="Courier New" w:cs="Courier New" w:hint="default"/>
+      </w:rPr>
+    </w:lvl>
+    <w:lvl w:ilvl="8" w:tplc="04090005" w:tentative="1">
+      <w:start w:val="1"/>
+      <w:numFmt w:val="bullet"/>
+      <w:lvlText w:val=""/>
+      <w:lvlJc w:val="left"/>
+      <w:pPr>
+        <w:ind w:left="6480" w:hanging="360"/>
+      </w:pPr>
+      <w:rPr>
+        <w:rFonts w:ascii="Wingdings" w:hAnsi="Wingdings" w:hint="default"/>
+      </w:rPr>
+    </w:lvl>
+  </w:abstractNum>
+  <w:abstractNum w:abstractNumId="4" w15:restartNumberingAfterBreak="0">
+    <w:nsid w:val="29E737F6"/>
+    <w:multiLevelType w:val="hybridMultilevel"/>
+    <w:tmpl w:val="4BE88198"/>
+    <w:lvl w:ilvl="0" w:tplc="04090001">
+      <w:start w:val="1"/>
+      <w:numFmt w:val="bullet"/>
+      <w:lvlText w:val=""/>
+      <w:lvlJc w:val="left"/>
+      <w:pPr>
+        <w:ind w:left="720" w:hanging="360"/>
+      </w:pPr>
+      <w:rPr>
+        <w:rFonts w:ascii="Symbol" w:hAnsi="Symbol" w:hint="default"/>
+      </w:rPr>
+    </w:lvl>
+    <w:lvl w:ilvl="1" w:tplc="04090003" w:tentative="1">
+      <w:start w:val="1"/>
+      <w:numFmt w:val="bullet"/>
+      <w:lvlText w:val="o"/>
+      <w:lvlJc w:val="left"/>
+      <w:pPr>
+        <w:ind w:left="1440" w:hanging="360"/>
+      </w:pPr>
+      <w:rPr>
+        <w:rFonts w:ascii="Courier New" w:hAnsi="Courier New" w:cs="Courier New" w:hint="default"/>
+      </w:rPr>
+    </w:lvl>
+    <w:lvl w:ilvl="2" w:tplc="04090005" w:tentative="1">
+      <w:start w:val="1"/>
+      <w:numFmt w:val="bullet"/>
+      <w:lvlText w:val=""/>
+      <w:lvlJc w:val="left"/>
+      <w:pPr>
+        <w:ind w:left="2160" w:hanging="360"/>
+      </w:pPr>
+      <w:rPr>
+        <w:rFonts w:ascii="Wingdings" w:hAnsi="Wingdings" w:hint="default"/>
+      </w:rPr>
+    </w:lvl>
+    <w:lvl w:ilvl="3" w:tplc="04090001" w:tentative="1">
+      <w:start w:val="1"/>
+      <w:numFmt w:val="bullet"/>
+      <w:lvlText w:val=""/>
+      <w:lvlJc w:val="left"/>
+      <w:pPr>
+        <w:ind w:left="2880" w:hanging="360"/>
+      </w:pPr>
+      <w:rPr>
+        <w:rFonts w:ascii="Symbol" w:hAnsi="Symbol" w:hint="default"/>
+      </w:rPr>
+    </w:lvl>
+    <w:lvl w:ilvl="4" w:tplc="04090003" w:tentative="1">
+      <w:start w:val="1"/>
+      <w:numFmt w:val="bullet"/>
+      <w:lvlText w:val="o"/>
+      <w:lvlJc w:val="left"/>
+      <w:pPr>
+        <w:ind w:left="3600" w:hanging="360"/>
+      </w:pPr>
+      <w:rPr>
+        <w:rFonts w:ascii="Courier New" w:hAnsi="Courier New" w:cs="Courier New" w:hint="default"/>
+      </w:rPr>
+    </w:lvl>
+    <w:lvl w:ilvl="5" w:tplc="04090005" w:tentative="1">
+      <w:start w:val="1"/>
+      <w:numFmt w:val="bullet"/>
+      <w:lvlText w:val=""/>
+      <w:lvlJc w:val="left"/>
+      <w:pPr>
+        <w:ind w:left="4320" w:hanging="360"/>
+      </w:pPr>
+      <w:rPr>
+        <w:rFonts w:ascii="Wingdings" w:hAnsi="Wingdings" w:hint="default"/>
+      </w:rPr>
+    </w:lvl>
+    <w:lvl w:ilvl="6" w:tplc="04090001" w:tentative="1">
+      <w:start w:val="1"/>
+      <w:numFmt w:val="bullet"/>
+      <w:lvlText w:val=""/>
+      <w:lvlJc w:val="left"/>
+      <w:pPr>
+        <w:ind w:left="5040" w:hanging="360"/>
+      </w:pPr>
+      <w:rPr>
+        <w:rFonts w:ascii="Symbol" w:hAnsi="Symbol" w:hint="default"/>
+      </w:rPr>
+    </w:lvl>
+    <w:lvl w:ilvl="7" w:tplc="04090003" w:tentative="1">
+      <w:start w:val="1"/>
+      <w:numFmt w:val="bullet"/>
+      <w:lvlText w:val="o"/>
+      <w:lvlJc w:val="left"/>
+      <w:pPr>
+        <w:ind w:left="5760" w:hanging="360"/>
+      </w:pPr>
+      <w:rPr>
+        <w:rFonts w:ascii="Courier New" w:hAnsi="Courier New" w:cs="Courier New" w:hint="default"/>
+      </w:rPr>
+    </w:lvl>
+    <w:lvl w:ilvl="8" w:tplc="04090005" w:tentative="1">
+      <w:start w:val="1"/>
+      <w:numFmt w:val="bullet"/>
+      <w:lvlText w:val=""/>
+      <w:lvlJc w:val="left"/>
+      <w:pPr>
+        <w:ind w:left="6480" w:hanging="360"/>
+      </w:pPr>
+      <w:rPr>
+        <w:rFonts w:ascii="Wingdings" w:hAnsi="Wingdings" w:hint="default"/>
+      </w:rPr>
+    </w:lvl>
+  </w:abstractNum>
+  <w:abstractNum w:abstractNumId="5" w15:restartNumberingAfterBreak="0">
+    <w:nsid w:val="63255523"/>
+    <w:multiLevelType w:val="hybridMultilevel"/>
+    <w:tmpl w:val="C74E8570"/>
+    <w:lvl w:ilvl="0" w:tplc="04090001">
+      <w:start w:val="1"/>
+      <w:numFmt w:val="bullet"/>
+      <w:lvlText w:val=""/>
+      <w:lvlJc w:val="left"/>
+      <w:pPr>
+        <w:ind w:left="1440" w:hanging="360"/>
+      </w:pPr>
+      <w:rPr>
+        <w:rFonts w:ascii="Symbol" w:hAnsi="Symbol" w:hint="default"/>
+      </w:rPr>
+    </w:lvl>
+    <w:lvl w:ilvl="1" w:tplc="04090003" w:tentative="1">
+      <w:start w:val="1"/>
+      <w:numFmt w:val="bullet"/>
+      <w:lvlText w:val="o"/>
+      <w:lvlJc w:val="left"/>
+      <w:pPr>
+        <w:ind w:left="2160" w:hanging="360"/>
+      </w:pPr>
+      <w:rPr>
+        <w:rFonts w:ascii="Courier New" w:hAnsi="Courier New" w:cs="Courier New" w:hint="default"/>
+      </w:rPr>
+    </w:lvl>
+    <w:lvl w:ilvl="2" w:tplc="04090005" w:tentative="1">
+      <w:start w:val="1"/>
+      <w:numFmt w:val="bullet"/>
+      <w:lvlText w:val=""/>
+      <w:lvlJc w:val="left"/>
+      <w:pPr>
+        <w:ind w:left="2880" w:hanging="360"/>
+      </w:pPr>
+      <w:rPr>
+        <w:rFonts w:ascii="Wingdings" w:hAnsi="Wingdings" w:hint="default"/>
+      </w:rPr>
+    </w:lvl>
+    <w:lvl w:ilvl="3" w:tplc="04090001" w:tentative="1">
+      <w:start w:val="1"/>
+      <w:numFmt w:val="bullet"/>
+      <w:lvlText w:val=""/>
+      <w:lvlJc w:val="left"/>
+      <w:pPr>
+        <w:ind w:left="3600" w:hanging="360"/>
+      </w:pPr>
+      <w:rPr>
+        <w:rFonts w:ascii="Symbol" w:hAnsi="Symbol" w:hint="default"/>
+      </w:rPr>
+    </w:lvl>
+    <w:lvl w:ilvl="4" w:tplc="04090003" w:tentative="1">
+      <w:start w:val="1"/>
+      <w:numFmt w:val="bullet"/>
+      <w:lvlText w:val="o"/>
+      <w:lvlJc w:val="left"/>
+      <w:pPr>
+        <w:ind w:left="4320" w:hanging="360"/>
+      </w:pPr>
+      <w:rPr>
+        <w:rFonts w:ascii="Courier New" w:hAnsi="Courier New" w:cs="Courier New" w:hint="default"/>
+      </w:rPr>
+    </w:lvl>
+    <w:lvl w:ilvl="5" w:tplc="04090005" w:tentative="1">
+      <w:start w:val="1"/>
+      <w:numFmt w:val="bullet"/>
+      <w:lvlText w:val=""/>
+      <w:lvlJc w:val="left"/>
+      <w:pPr>
+        <w:ind w:left="5040" w:hanging="360"/>
+      </w:pPr>
+      <w:rPr>
+        <w:rFonts w:ascii="Wingdings" w:hAnsi="Wingdings" w:hint="default"/>
+      </w:rPr>
+    </w:lvl>
+    <w:lvl w:ilvl="6" w:tplc="04090001" w:tentative="1">
+      <w:start w:val="1"/>
+      <w:numFmt w:val="bullet"/>
+      <w:lvlText w:val=""/>
+      <w:lvlJc w:val="left"/>
+      <w:pPr>
+        <w:ind w:left="5760" w:hanging="360"/>
+      </w:pPr>
+      <w:rPr>
+        <w:rFonts w:ascii="Symbol" w:hAnsi="Symbol" w:hint="default"/>
+      </w:rPr>
+    </w:lvl>
+    <w:lvl w:ilvl="7" w:tplc="04090003" w:tentative="1">
+      <w:start w:val="1"/>
+      <w:numFmt w:val="bullet"/>
+      <w:lvlText w:val="o"/>
+      <w:lvlJc w:val="left"/>
+      <w:pPr>
+        <w:ind w:left="6480" w:hanging="360"/>
+      </w:pPr>
+      <w:rPr>
+        <w:rFonts w:ascii="Courier New" w:hAnsi="Courier New" w:cs="Courier New" w:hint="default"/>
+      </w:rPr>
+    </w:lvl>
+    <w:lvl w:ilvl="8" w:tplc="04090005" w:tentative="1">
+      <w:start w:val="1"/>
+      <w:numFmt w:val="bullet"/>
+      <w:lvlText w:val=""/>
+      <w:lvlJc w:val="left"/>
+      <w:pPr>
+        <w:ind w:left="7200" w:hanging="360"/>
+      </w:pPr>
+      <w:rPr>
+        <w:rFonts w:ascii="Wingdings" w:hAnsi="Wingdings" w:hint="default"/>
+      </w:rPr>
+    </w:lvl>
+  </w:abstractNum>
+  <w:abstractNum w:abstractNumId="6" w15:restartNumberingAfterBreak="0">
+    <w:nsid w:val="74936E48"/>
+    <w:multiLevelType w:val="hybridMultilevel"/>
+    <w:tmpl w:val="219CB68E"/>
+    <w:lvl w:ilvl="0" w:tplc="04090001">
+      <w:start w:val="1"/>
+      <w:numFmt w:val="bullet"/>
+      <w:lvlText w:val=""/>
+      <w:lvlJc w:val="left"/>
+      <w:pPr>
+        <w:ind w:left="1440" w:hanging="360"/>
+      </w:pPr>
+      <w:rPr>
+        <w:rFonts w:ascii="Symbol" w:hAnsi="Symbol" w:hint="default"/>
+      </w:rPr>
+    </w:lvl>
+    <w:lvl w:ilvl="1" w:tplc="04090003" w:tentative="1">
+      <w:start w:val="1"/>
+      <w:numFmt w:val="bullet"/>
+      <w:lvlText w:val="o"/>
+      <w:lvlJc w:val="left"/>
+      <w:pPr>
+        <w:ind w:left="2160" w:hanging="360"/>
+      </w:pPr>
+      <w:rPr>
+        <w:rFonts w:ascii="Courier New" w:hAnsi="Courier New" w:cs="Courier New" w:hint="default"/>
+      </w:rPr>
+    </w:lvl>
+    <w:lvl w:ilvl="2" w:tplc="04090005" w:tentative="1">
+      <w:start w:val="1"/>
+      <w:numFmt w:val="bullet"/>
+      <w:lvlText w:val=""/>
+      <w:lvlJc w:val="left"/>
+      <w:pPr>
+        <w:ind w:left="2880" w:hanging="360"/>
+      </w:pPr>
+      <w:rPr>
+        <w:rFonts w:ascii="Wingdings" w:hAnsi="Wingdings" w:hint="default"/>
+      </w:rPr>
+    </w:lvl>
+    <w:lvl w:ilvl="3" w:tplc="04090001" w:tentative="1">
+      <w:start w:val="1"/>
+      <w:numFmt w:val="bullet"/>
+      <w:lvlText w:val=""/>
+      <w:lvlJc w:val="left"/>
+      <w:pPr>
+        <w:ind w:left="3600" w:hanging="360"/>
+      </w:pPr>
+      <w:rPr>
+        <w:rFonts w:ascii="Symbol" w:hAnsi="Symbol" w:hint="default"/>
+      </w:rPr>
+    </w:lvl>
+    <w:lvl w:ilvl="4" w:tplc="04090003" w:tentative="1">
+      <w:start w:val="1"/>
+      <w:numFmt w:val="bullet"/>
+      <w:lvlText w:val="o"/>
+      <w:lvlJc w:val="left"/>
+      <w:pPr>
+        <w:ind w:left="4320" w:hanging="360"/>
+      </w:pPr>
+      <w:rPr>
+        <w:rFonts w:ascii="Courier New" w:hAnsi="Courier New" w:cs="Courier New" w:hint="default"/>
+      </w:rPr>
+    </w:lvl>
+    <w:lvl w:ilvl="5" w:tplc="04090005" w:tentative="1">
+      <w:start w:val="1"/>
+      <w:numFmt w:val="bullet"/>
+      <w:lvlText w:val=""/>
+      <w:lvlJc w:val="left"/>
+      <w:pPr>
+        <w:ind w:left="5040" w:hanging="360"/>
+      </w:pPr>
+      <w:rPr>
+        <w:rFonts w:ascii="Wingdings" w:hAnsi="Wingdings" w:hint="default"/>
+      </w:rPr>
+    </w:lvl>
+    <w:lvl w:ilvl="6" w:tplc="04090001" w:tentative="1">
+      <w:start w:val="1"/>
+      <w:numFmt w:val="bullet"/>
+      <w:lvlText w:val=""/>
+      <w:lvlJc w:val="left"/>
+      <w:pPr>
+        <w:ind w:left="5760" w:hanging="360"/>
+      </w:pPr>
+      <w:rPr>
+        <w:rFonts w:ascii="Symbol" w:hAnsi="Symbol" w:hint="default"/>
+      </w:rPr>
+    </w:lvl>
+    <w:lvl w:ilvl="7" w:tplc="04090003" w:tentative="1">
+      <w:start w:val="1"/>
+      <w:numFmt w:val="bullet"/>
+      <w:lvlText w:val="o"/>
+      <w:lvlJc w:val="left"/>
+      <w:pPr>
+        <w:ind w:left="6480" w:hanging="360"/>
+      </w:pPr>
+      <w:rPr>
+        <w:rFonts w:ascii="Courier New" w:hAnsi="Courier New" w:cs="Courier New" w:hint="default"/>
+      </w:rPr>
+    </w:lvl>
+    <w:lvl w:ilvl="8" w:tplc="04090005" w:tentative="1">
+      <w:start w:val="1"/>
+      <w:numFmt w:val="bullet"/>
+      <w:lvlText w:val=""/>
+      <w:lvlJc w:val="left"/>
+      <w:pPr>
+        <w:ind w:left="7200" w:hanging="360"/>
+      </w:pPr>
+      <w:rPr>
+        <w:rFonts w:ascii="Wingdings" w:hAnsi="Wingdings" w:hint="default"/>
+      </w:rPr>
+    </w:lvl>
+  </w:abstractNum>
+  <w:num w:numId="1" w16cid:durableId="1113209063">
+    <w:abstractNumId w:val="2"/>
+  </w:num>
+  <w:num w:numId="2" w16cid:durableId="891306324">
+    <w:abstractNumId w:val="5"/>
+  </w:num>
+  <w:num w:numId="3" w16cid:durableId="1372532498">
+    <w:abstractNumId w:val="1"/>
+  </w:num>
+  <w:num w:numId="4" w16cid:durableId="1401323404">
+    <w:abstractNumId w:val="0"/>
+  </w:num>
+  <w:num w:numId="5" w16cid:durableId="593439730">
+    <w:abstractNumId w:val="3"/>
+  </w:num>
+  <w:num w:numId="6" w16cid:durableId="41948373">
+    <w:abstractNumId w:val="6"/>
+  </w:num>
+  <w:num w:numId="7" w16cid:durableId="2091534204">
+    <w:abstractNumId w:val="4"/>
+  </w:num>
+</w:numbering>
+</file>
+
 <file path=word/styles.xml><?xml version="1.0" encoding="utf-8"?>
 <w:styles xmlns:mc="http://schemas.openxmlformats.org/markup-compatibility/2006" xmlns:r="http://schemas.openxmlformats.org/officeDocument/2006/relationships" xmlns:w="http://schemas.openxmlformats.org/wordprocessingml/2006/main" xmlns:w14="http://schemas.microsoft.com/office/word/2010/wordml" xmlns:w15="http://schemas.microsoft.com/office/word/2012/wordml" xmlns:w16cex="http://schemas.microsoft.com/office/word/2018/wordml/cex" xmlns:w16cid="http://schemas.microsoft.com/office/word/2016/wordml/cid" xmlns:w16="http://schemas.microsoft.com/office/word/2018/wordml" xmlns:w16du="http://schemas.microsoft.com/office/word/2023/wordml/word16du" xmlns:w16sdtdh="http://schemas.microsoft.com/office/word/2020/wordml/sdtdatahash" xmlns:w16sdtfl="http://schemas.microsoft.com/office/word/2024/wordml/sdtformatlock" xmlns:w16se="http://schemas.microsoft.com/office/word/2015/wordml/symex" mc:Ignorable="w14 w15 w16se w16cid w16 w16cex w16sdtdh w16sdtfl w16du">
   <w:docDefaults>
     <w:rPrDefault>
       <w:rPr>
-        <w:rFonts w:asciiTheme="minorHAnsi" w:eastAsiaTheme="minorHAnsi" w:hAnsiTheme="minorHAnsi" w:cstheme="minorBidi"/>
-        <w:kern w:val="2"/>
-        <w:sz w:val="24"/>
-        <w:szCs w:val="24"/>
+        <w:rFonts w:asciiTheme="minorHAnsi" w:eastAsiaTheme="minorEastAsia" w:hAnsiTheme="minorHAnsi" w:cstheme="minorBidi"/>
+        <w:sz w:val="22"/>
+        <w:szCs w:val="22"/>
         <w:lang w:val="en-US" w:eastAsia="en-US" w:bidi="ar-SA"/>
-        <w14:ligatures w14:val="standardContextual"/>
       </w:rPr>
     </w:rPrDefault>
     <w:pPrDefault>
       <w:pPr>
-        <w:spacing w:after="160" w:line="278" w:lineRule="auto"/>
+        <w:spacing w:after="160" w:line="259" w:lineRule="auto"/>
       </w:pPr>
     </w:pPrDefault>
   </w:docDefaults>
@@ -526,6 +1459,7 @@
   <w:style w:type="paragraph" w:default="1" w:styleId="Normal">
     <w:name w:val="Normal"/>
     <w:qFormat/>
+    <w:rsid w:val="006B1E90"/>
   </w:style>
   <w:style w:type="paragraph" w:styleId="Heading1">
     <w:name w:val="heading 1"/>
@@ -534,18 +1468,18 @@
     <w:link w:val="Heading1Char"/>
     <w:uiPriority w:val="9"/>
     <w:qFormat/>
-    <w:rsid w:val="003A58E8"/>
+    <w:rsid w:val="006B1E90"/>
     <w:pPr>
       <w:keepNext/>
       <w:keepLines/>
-      <w:spacing w:before="360" w:after="80"/>
+      <w:spacing w:before="400" w:after="40" w:line="240" w:lineRule="auto"/>
       <w:outlineLvl w:val="0"/>
     </w:pPr>
     <w:rPr>
       <w:rFonts w:asciiTheme="majorHAnsi" w:eastAsiaTheme="majorEastAsia" w:hAnsiTheme="majorHAnsi" w:cstheme="majorBidi"/>
-      <w:color w:val="0F4761" w:themeColor="accent1" w:themeShade="BF"/>
-      <w:sz w:val="40"/>
-      <w:szCs w:val="40"/>
+      <w:color w:val="0A2F41" w:themeColor="accent1" w:themeShade="80"/>
+      <w:sz w:val="36"/>
+      <w:szCs w:val="36"/>
     </w:rPr>
   </w:style>
   <w:style w:type="paragraph" w:styleId="Heading2">
@@ -557,11 +1491,11 @@
     <w:semiHidden/>
     <w:unhideWhenUsed/>
     <w:qFormat/>
-    <w:rsid w:val="003A58E8"/>
+    <w:rsid w:val="006B1E90"/>
     <w:pPr>
       <w:keepNext/>
       <w:keepLines/>
-      <w:spacing w:before="160" w:after="80"/>
+      <w:spacing w:before="40" w:after="0" w:line="240" w:lineRule="auto"/>
       <w:outlineLvl w:val="1"/>
     </w:pPr>
     <w:rPr>
@@ -580,15 +1514,15 @@
     <w:semiHidden/>
     <w:unhideWhenUsed/>
     <w:qFormat/>
-    <w:rsid w:val="003A58E8"/>
+    <w:rsid w:val="006B1E90"/>
     <w:pPr>
       <w:keepNext/>
       <w:keepLines/>
-      <w:spacing w:before="160" w:after="80"/>
+      <w:spacing w:before="40" w:after="0" w:line="240" w:lineRule="auto"/>
       <w:outlineLvl w:val="2"/>
     </w:pPr>
     <w:rPr>
-      <w:rFonts w:eastAsiaTheme="majorEastAsia" w:cstheme="majorBidi"/>
+      <w:rFonts w:asciiTheme="majorHAnsi" w:eastAsiaTheme="majorEastAsia" w:hAnsiTheme="majorHAnsi" w:cstheme="majorBidi"/>
       <w:color w:val="0F4761" w:themeColor="accent1" w:themeShade="BF"/>
       <w:sz w:val="28"/>
       <w:szCs w:val="28"/>
@@ -603,18 +1537,18 @@
     <w:semiHidden/>
     <w:unhideWhenUsed/>
     <w:qFormat/>
-    <w:rsid w:val="003A58E8"/>
+    <w:rsid w:val="006B1E90"/>
     <w:pPr>
       <w:keepNext/>
       <w:keepLines/>
-      <w:spacing w:before="80" w:after="40"/>
+      <w:spacing w:before="40" w:after="0"/>
       <w:outlineLvl w:val="3"/>
     </w:pPr>
     <w:rPr>
-      <w:rFonts w:eastAsiaTheme="majorEastAsia" w:cstheme="majorBidi"/>
-      <w:i/>
-      <w:iCs/>
+      <w:rFonts w:asciiTheme="majorHAnsi" w:eastAsiaTheme="majorEastAsia" w:hAnsiTheme="majorHAnsi" w:cstheme="majorBidi"/>
       <w:color w:val="0F4761" w:themeColor="accent1" w:themeShade="BF"/>
+      <w:sz w:val="24"/>
+      <w:szCs w:val="24"/>
     </w:rPr>
   </w:style>
   <w:style w:type="paragraph" w:styleId="Heading5">
@@ -626,15 +1560,16 @@
     <w:semiHidden/>
     <w:unhideWhenUsed/>
     <w:qFormat/>
-    <w:rsid w:val="003A58E8"/>
+    <w:rsid w:val="006B1E90"/>
     <w:pPr>
       <w:keepNext/>
       <w:keepLines/>
-      <w:spacing w:before="80" w:after="40"/>
+      <w:spacing w:before="40" w:after="0"/>
       <w:outlineLvl w:val="4"/>
     </w:pPr>
     <w:rPr>
-      <w:rFonts w:eastAsiaTheme="majorEastAsia" w:cstheme="majorBidi"/>
+      <w:rFonts w:asciiTheme="majorHAnsi" w:eastAsiaTheme="majorEastAsia" w:hAnsiTheme="majorHAnsi" w:cstheme="majorBidi"/>
+      <w:caps/>
       <w:color w:val="0F4761" w:themeColor="accent1" w:themeShade="BF"/>
     </w:rPr>
   </w:style>
@@ -647,7 +1582,7 @@
     <w:semiHidden/>
     <w:unhideWhenUsed/>
     <w:qFormat/>
-    <w:rsid w:val="003A58E8"/>
+    <w:rsid w:val="006B1E90"/>
     <w:pPr>
       <w:keepNext/>
       <w:keepLines/>
@@ -655,10 +1590,11 @@
       <w:outlineLvl w:val="5"/>
     </w:pPr>
     <w:rPr>
-      <w:rFonts w:eastAsiaTheme="majorEastAsia" w:cstheme="majorBidi"/>
+      <w:rFonts w:asciiTheme="majorHAnsi" w:eastAsiaTheme="majorEastAsia" w:hAnsiTheme="majorHAnsi" w:cstheme="majorBidi"/>
       <w:i/>
       <w:iCs/>
-      <w:color w:val="595959" w:themeColor="text1" w:themeTint="A6"/>
+      <w:caps/>
+      <w:color w:val="0A2F41" w:themeColor="accent1" w:themeShade="80"/>
     </w:rPr>
   </w:style>
   <w:style w:type="paragraph" w:styleId="Heading7">
@@ -670,7 +1606,7 @@
     <w:semiHidden/>
     <w:unhideWhenUsed/>
     <w:qFormat/>
-    <w:rsid w:val="003A58E8"/>
+    <w:rsid w:val="006B1E90"/>
     <w:pPr>
       <w:keepNext/>
       <w:keepLines/>
@@ -678,8 +1614,10 @@
       <w:outlineLvl w:val="6"/>
     </w:pPr>
     <w:rPr>
-      <w:rFonts w:eastAsiaTheme="majorEastAsia" w:cstheme="majorBidi"/>
-      <w:color w:val="595959" w:themeColor="text1" w:themeTint="A6"/>
+      <w:rFonts w:asciiTheme="majorHAnsi" w:eastAsiaTheme="majorEastAsia" w:hAnsiTheme="majorHAnsi" w:cstheme="majorBidi"/>
+      <w:b/>
+      <w:bCs/>
+      <w:color w:val="0A2F41" w:themeColor="accent1" w:themeShade="80"/>
     </w:rPr>
   </w:style>
   <w:style w:type="paragraph" w:styleId="Heading8">
@@ -691,18 +1629,20 @@
     <w:semiHidden/>
     <w:unhideWhenUsed/>
     <w:qFormat/>
-    <w:rsid w:val="003A58E8"/>
+    <w:rsid w:val="006B1E90"/>
     <w:pPr>
       <w:keepNext/>
       <w:keepLines/>
-      <w:spacing w:after="0"/>
+      <w:spacing w:before="40" w:after="0"/>
       <w:outlineLvl w:val="7"/>
     </w:pPr>
     <w:rPr>
-      <w:rFonts w:eastAsiaTheme="majorEastAsia" w:cstheme="majorBidi"/>
+      <w:rFonts w:asciiTheme="majorHAnsi" w:eastAsiaTheme="majorEastAsia" w:hAnsiTheme="majorHAnsi" w:cstheme="majorBidi"/>
+      <w:b/>
+      <w:bCs/>
       <w:i/>
       <w:iCs/>
-      <w:color w:val="272727" w:themeColor="text1" w:themeTint="D8"/>
+      <w:color w:val="0A2F41" w:themeColor="accent1" w:themeShade="80"/>
     </w:rPr>
   </w:style>
   <w:style w:type="paragraph" w:styleId="Heading9">
@@ -714,22 +1654,23 @@
     <w:semiHidden/>
     <w:unhideWhenUsed/>
     <w:qFormat/>
-    <w:rsid w:val="003A58E8"/>
+    <w:rsid w:val="006B1E90"/>
     <w:pPr>
       <w:keepNext/>
       <w:keepLines/>
-      <w:spacing w:after="0"/>
+      <w:spacing w:before="40" w:after="0"/>
       <w:outlineLvl w:val="8"/>
     </w:pPr>
     <w:rPr>
-      <w:rFonts w:eastAsiaTheme="majorEastAsia" w:cstheme="majorBidi"/>
-      <w:color w:val="272727" w:themeColor="text1" w:themeTint="D8"/>
+      <w:rFonts w:asciiTheme="majorHAnsi" w:eastAsiaTheme="majorEastAsia" w:hAnsiTheme="majorHAnsi" w:cstheme="majorBidi"/>
+      <w:i/>
+      <w:iCs/>
+      <w:color w:val="0A2F41" w:themeColor="accent1" w:themeShade="80"/>
     </w:rPr>
   </w:style>
   <w:style w:type="character" w:default="1" w:styleId="DefaultParagraphFont">
     <w:name w:val="Default Paragraph Font"/>
     <w:uiPriority w:val="1"/>
-    <w:semiHidden/>
     <w:unhideWhenUsed/>
   </w:style>
   <w:style w:type="table" w:default="1" w:styleId="TableNormal">
@@ -758,12 +1699,12 @@
     <w:basedOn w:val="DefaultParagraphFont"/>
     <w:link w:val="Heading1"/>
     <w:uiPriority w:val="9"/>
-    <w:rsid w:val="003A58E8"/>
+    <w:rsid w:val="006B1E90"/>
     <w:rPr>
       <w:rFonts w:asciiTheme="majorHAnsi" w:eastAsiaTheme="majorEastAsia" w:hAnsiTheme="majorHAnsi" w:cstheme="majorBidi"/>
-      <w:color w:val="0F4761" w:themeColor="accent1" w:themeShade="BF"/>
-      <w:sz w:val="40"/>
-      <w:szCs w:val="40"/>
+      <w:color w:val="0A2F41" w:themeColor="accent1" w:themeShade="80"/>
+      <w:sz w:val="36"/>
+      <w:szCs w:val="36"/>
     </w:rPr>
   </w:style>
   <w:style w:type="character" w:customStyle="1" w:styleId="Heading2Char">
@@ -772,7 +1713,7 @@
     <w:link w:val="Heading2"/>
     <w:uiPriority w:val="9"/>
     <w:semiHidden/>
-    <w:rsid w:val="003A58E8"/>
+    <w:rsid w:val="006B1E90"/>
     <w:rPr>
       <w:rFonts w:asciiTheme="majorHAnsi" w:eastAsiaTheme="majorEastAsia" w:hAnsiTheme="majorHAnsi" w:cstheme="majorBidi"/>
       <w:color w:val="0F4761" w:themeColor="accent1" w:themeShade="BF"/>
@@ -786,9 +1727,9 @@
     <w:link w:val="Heading3"/>
     <w:uiPriority w:val="9"/>
     <w:semiHidden/>
-    <w:rsid w:val="003A58E8"/>
-    <w:rPr>
-      <w:rFonts w:eastAsiaTheme="majorEastAsia" w:cstheme="majorBidi"/>
+    <w:rsid w:val="006B1E90"/>
+    <w:rPr>
+      <w:rFonts w:asciiTheme="majorHAnsi" w:eastAsiaTheme="majorEastAsia" w:hAnsiTheme="majorHAnsi" w:cstheme="majorBidi"/>
       <w:color w:val="0F4761" w:themeColor="accent1" w:themeShade="BF"/>
       <w:sz w:val="28"/>
       <w:szCs w:val="28"/>
@@ -800,12 +1741,12 @@
     <w:link w:val="Heading4"/>
     <w:uiPriority w:val="9"/>
     <w:semiHidden/>
-    <w:rsid w:val="003A58E8"/>
-    <w:rPr>
-      <w:rFonts w:eastAsiaTheme="majorEastAsia" w:cstheme="majorBidi"/>
-      <w:i/>
-      <w:iCs/>
+    <w:rsid w:val="006B1E90"/>
+    <w:rPr>
+      <w:rFonts w:asciiTheme="majorHAnsi" w:eastAsiaTheme="majorEastAsia" w:hAnsiTheme="majorHAnsi" w:cstheme="majorBidi"/>
       <w:color w:val="0F4761" w:themeColor="accent1" w:themeShade="BF"/>
+      <w:sz w:val="24"/>
+      <w:szCs w:val="24"/>
     </w:rPr>
   </w:style>
   <w:style w:type="character" w:customStyle="1" w:styleId="Heading5Char">
@@ -814,9 +1755,10 @@
     <w:link w:val="Heading5"/>
     <w:uiPriority w:val="9"/>
     <w:semiHidden/>
-    <w:rsid w:val="003A58E8"/>
-    <w:rPr>
-      <w:rFonts w:eastAsiaTheme="majorEastAsia" w:cstheme="majorBidi"/>
+    <w:rsid w:val="006B1E90"/>
+    <w:rPr>
+      <w:rFonts w:asciiTheme="majorHAnsi" w:eastAsiaTheme="majorEastAsia" w:hAnsiTheme="majorHAnsi" w:cstheme="majorBidi"/>
+      <w:caps/>
       <w:color w:val="0F4761" w:themeColor="accent1" w:themeShade="BF"/>
     </w:rPr>
   </w:style>
@@ -826,12 +1768,13 @@
     <w:link w:val="Heading6"/>
     <w:uiPriority w:val="9"/>
     <w:semiHidden/>
-    <w:rsid w:val="003A58E8"/>
-    <w:rPr>
-      <w:rFonts w:eastAsiaTheme="majorEastAsia" w:cstheme="majorBidi"/>
+    <w:rsid w:val="006B1E90"/>
+    <w:rPr>
+      <w:rFonts w:asciiTheme="majorHAnsi" w:eastAsiaTheme="majorEastAsia" w:hAnsiTheme="majorHAnsi" w:cstheme="majorBidi"/>
       <w:i/>
       <w:iCs/>
-      <w:color w:val="595959" w:themeColor="text1" w:themeTint="A6"/>
+      <w:caps/>
+      <w:color w:val="0A2F41" w:themeColor="accent1" w:themeShade="80"/>
     </w:rPr>
   </w:style>
   <w:style w:type="character" w:customStyle="1" w:styleId="Heading7Char">
@@ -840,10 +1783,12 @@
     <w:link w:val="Heading7"/>
     <w:uiPriority w:val="9"/>
     <w:semiHidden/>
-    <w:rsid w:val="003A58E8"/>
-    <w:rPr>
-      <w:rFonts w:eastAsiaTheme="majorEastAsia" w:cstheme="majorBidi"/>
-      <w:color w:val="595959" w:themeColor="text1" w:themeTint="A6"/>
+    <w:rsid w:val="006B1E90"/>
+    <w:rPr>
+      <w:rFonts w:asciiTheme="majorHAnsi" w:eastAsiaTheme="majorEastAsia" w:hAnsiTheme="majorHAnsi" w:cstheme="majorBidi"/>
+      <w:b/>
+      <w:bCs/>
+      <w:color w:val="0A2F41" w:themeColor="accent1" w:themeShade="80"/>
     </w:rPr>
   </w:style>
   <w:style w:type="character" w:customStyle="1" w:styleId="Heading8Char">
@@ -852,12 +1797,14 @@
     <w:link w:val="Heading8"/>
     <w:uiPriority w:val="9"/>
     <w:semiHidden/>
-    <w:rsid w:val="003A58E8"/>
-    <w:rPr>
-      <w:rFonts w:eastAsiaTheme="majorEastAsia" w:cstheme="majorBidi"/>
+    <w:rsid w:val="006B1E90"/>
+    <w:rPr>
+      <w:rFonts w:asciiTheme="majorHAnsi" w:eastAsiaTheme="majorEastAsia" w:hAnsiTheme="majorHAnsi" w:cstheme="majorBidi"/>
+      <w:b/>
+      <w:bCs/>
       <w:i/>
       <w:iCs/>
-      <w:color w:val="272727" w:themeColor="text1" w:themeTint="D8"/>
+      <w:color w:val="0A2F41" w:themeColor="accent1" w:themeShade="80"/>
     </w:rPr>
   </w:style>
   <w:style w:type="character" w:customStyle="1" w:styleId="Heading9Char">
@@ -866,10 +1813,12 @@
     <w:link w:val="Heading9"/>
     <w:uiPriority w:val="9"/>
     <w:semiHidden/>
-    <w:rsid w:val="003A58E8"/>
-    <w:rPr>
-      <w:rFonts w:eastAsiaTheme="majorEastAsia" w:cstheme="majorBidi"/>
-      <w:color w:val="272727" w:themeColor="text1" w:themeTint="D8"/>
+    <w:rsid w:val="006B1E90"/>
+    <w:rPr>
+      <w:rFonts w:asciiTheme="majorHAnsi" w:eastAsiaTheme="majorEastAsia" w:hAnsiTheme="majorHAnsi" w:cstheme="majorBidi"/>
+      <w:i/>
+      <w:iCs/>
+      <w:color w:val="0A2F41" w:themeColor="accent1" w:themeShade="80"/>
     </w:rPr>
   </w:style>
   <w:style w:type="paragraph" w:styleId="Title">
@@ -879,17 +1828,18 @@
     <w:link w:val="TitleChar"/>
     <w:uiPriority w:val="10"/>
     <w:qFormat/>
-    <w:rsid w:val="003A58E8"/>
+    <w:rsid w:val="006B1E90"/>
     <w:pPr>
-      <w:spacing w:after="80" w:line="240" w:lineRule="auto"/>
+      <w:spacing w:after="0" w:line="204" w:lineRule="auto"/>
       <w:contextualSpacing/>
     </w:pPr>
     <w:rPr>
       <w:rFonts w:asciiTheme="majorHAnsi" w:eastAsiaTheme="majorEastAsia" w:hAnsiTheme="majorHAnsi" w:cstheme="majorBidi"/>
-      <w:spacing w:val="-10"/>
-      <w:kern w:val="28"/>
-      <w:sz w:val="56"/>
-      <w:szCs w:val="56"/>
+      <w:caps/>
+      <w:color w:val="0E2841" w:themeColor="text2"/>
+      <w:spacing w:val="-15"/>
+      <w:sz w:val="72"/>
+      <w:szCs w:val="72"/>
     </w:rPr>
   </w:style>
   <w:style w:type="character" w:customStyle="1" w:styleId="TitleChar">
@@ -897,13 +1847,14 @@
     <w:basedOn w:val="DefaultParagraphFont"/>
     <w:link w:val="Title"/>
     <w:uiPriority w:val="10"/>
-    <w:rsid w:val="003A58E8"/>
+    <w:rsid w:val="006B1E90"/>
     <w:rPr>
       <w:rFonts w:asciiTheme="majorHAnsi" w:eastAsiaTheme="majorEastAsia" w:hAnsiTheme="majorHAnsi" w:cstheme="majorBidi"/>
-      <w:spacing w:val="-10"/>
-      <w:kern w:val="28"/>
-      <w:sz w:val="56"/>
-      <w:szCs w:val="56"/>
+      <w:caps/>
+      <w:color w:val="0E2841" w:themeColor="text2"/>
+      <w:spacing w:val="-15"/>
+      <w:sz w:val="72"/>
+      <w:szCs w:val="72"/>
     </w:rPr>
   </w:style>
   <w:style w:type="paragraph" w:styleId="Subtitle">
@@ -913,16 +1864,16 @@
     <w:link w:val="SubtitleChar"/>
     <w:uiPriority w:val="11"/>
     <w:qFormat/>
-    <w:rsid w:val="003A58E8"/>
+    <w:rsid w:val="006B1E90"/>
     <w:pPr>
       <w:numPr>
         <w:ilvl w:val="1"/>
       </w:numPr>
+      <w:spacing w:after="240" w:line="240" w:lineRule="auto"/>
     </w:pPr>
     <w:rPr>
-      <w:rFonts w:eastAsiaTheme="majorEastAsia" w:cstheme="majorBidi"/>
-      <w:color w:val="595959" w:themeColor="text1" w:themeTint="A6"/>
-      <w:spacing w:val="15"/>
+      <w:rFonts w:asciiTheme="majorHAnsi" w:eastAsiaTheme="majorEastAsia" w:hAnsiTheme="majorHAnsi" w:cstheme="majorBidi"/>
+      <w:color w:val="156082" w:themeColor="accent1"/>
       <w:sz w:val="28"/>
       <w:szCs w:val="28"/>
     </w:rPr>
@@ -932,11 +1883,10 @@
     <w:basedOn w:val="DefaultParagraphFont"/>
     <w:link w:val="Subtitle"/>
     <w:uiPriority w:val="11"/>
-    <w:rsid w:val="003A58E8"/>
-    <w:rPr>
-      <w:rFonts w:eastAsiaTheme="majorEastAsia" w:cstheme="majorBidi"/>
-      <w:color w:val="595959" w:themeColor="text1" w:themeTint="A6"/>
-      <w:spacing w:val="15"/>
+    <w:rsid w:val="006B1E90"/>
+    <w:rPr>
+      <w:rFonts w:asciiTheme="majorHAnsi" w:eastAsiaTheme="majorEastAsia" w:hAnsiTheme="majorHAnsi" w:cstheme="majorBidi"/>
+      <w:color w:val="156082" w:themeColor="accent1"/>
       <w:sz w:val="28"/>
       <w:szCs w:val="28"/>
     </w:rPr>
@@ -948,15 +1898,15 @@
     <w:link w:val="QuoteChar"/>
     <w:uiPriority w:val="29"/>
     <w:qFormat/>
-    <w:rsid w:val="003A58E8"/>
+    <w:rsid w:val="006B1E90"/>
     <w:pPr>
-      <w:spacing w:before="160"/>
-      <w:jc w:val="center"/>
+      <w:spacing w:before="120" w:after="120"/>
+      <w:ind w:left="720"/>
     </w:pPr>
     <w:rPr>
-      <w:i/>
-      <w:iCs/>
-      <w:color w:val="404040" w:themeColor="text1" w:themeTint="BF"/>
+      <w:color w:val="0E2841" w:themeColor="text2"/>
+      <w:sz w:val="24"/>
+      <w:szCs w:val="24"/>
     </w:rPr>
   </w:style>
   <w:style w:type="character" w:customStyle="1" w:styleId="QuoteChar">
@@ -964,11 +1914,11 @@
     <w:basedOn w:val="DefaultParagraphFont"/>
     <w:link w:val="Quote"/>
     <w:uiPriority w:val="29"/>
-    <w:rsid w:val="003A58E8"/>
-    <w:rPr>
-      <w:i/>
-      <w:iCs/>
-      <w:color w:val="404040" w:themeColor="text1" w:themeTint="BF"/>
+    <w:rsid w:val="006B1E90"/>
+    <w:rPr>
+      <w:color w:val="0E2841" w:themeColor="text2"/>
+      <w:sz w:val="24"/>
+      <w:szCs w:val="24"/>
     </w:rPr>
   </w:style>
   <w:style w:type="paragraph" w:styleId="ListParagraph">
@@ -987,11 +1937,12 @@
     <w:basedOn w:val="DefaultParagraphFont"/>
     <w:uiPriority w:val="21"/>
     <w:qFormat/>
-    <w:rsid w:val="003A58E8"/>
-    <w:rPr>
+    <w:rsid w:val="006B1E90"/>
+    <w:rPr>
+      <w:b/>
+      <w:bCs/>
       <w:i/>
       <w:iCs/>
-      <w:color w:val="0F4761" w:themeColor="accent1" w:themeShade="BF"/>
     </w:rPr>
   </w:style>
   <w:style w:type="paragraph" w:styleId="IntenseQuote">
@@ -1001,20 +1952,18 @@
     <w:link w:val="IntenseQuoteChar"/>
     <w:uiPriority w:val="30"/>
     <w:qFormat/>
-    <w:rsid w:val="003A58E8"/>
+    <w:rsid w:val="006B1E90"/>
     <w:pPr>
-      <w:pBdr>
-        <w:top w:val="single" w:sz="4" w:space="10" w:color="0F4761" w:themeColor="accent1" w:themeShade="BF"/>
-        <w:bottom w:val="single" w:sz="4" w:space="10" w:color="0F4761" w:themeColor="accent1" w:themeShade="BF"/>
-      </w:pBdr>
-      <w:spacing w:before="360" w:after="360"/>
-      <w:ind w:left="864" w:right="864"/>
+      <w:spacing w:before="100" w:beforeAutospacing="1" w:after="240" w:line="240" w:lineRule="auto"/>
+      <w:ind w:left="720"/>
       <w:jc w:val="center"/>
     </w:pPr>
     <w:rPr>
-      <w:i/>
-      <w:iCs/>
-      <w:color w:val="0F4761" w:themeColor="accent1" w:themeShade="BF"/>
+      <w:rFonts w:asciiTheme="majorHAnsi" w:eastAsiaTheme="majorEastAsia" w:hAnsiTheme="majorHAnsi" w:cstheme="majorBidi"/>
+      <w:color w:val="0E2841" w:themeColor="text2"/>
+      <w:spacing w:val="-6"/>
+      <w:sz w:val="32"/>
+      <w:szCs w:val="32"/>
     </w:rPr>
   </w:style>
   <w:style w:type="character" w:customStyle="1" w:styleId="IntenseQuoteChar">
@@ -1022,11 +1971,13 @@
     <w:basedOn w:val="DefaultParagraphFont"/>
     <w:link w:val="IntenseQuote"/>
     <w:uiPriority w:val="30"/>
-    <w:rsid w:val="003A58E8"/>
-    <w:rPr>
-      <w:i/>
-      <w:iCs/>
-      <w:color w:val="0F4761" w:themeColor="accent1" w:themeShade="BF"/>
+    <w:rsid w:val="006B1E90"/>
+    <w:rPr>
+      <w:rFonts w:asciiTheme="majorHAnsi" w:eastAsiaTheme="majorEastAsia" w:hAnsiTheme="majorHAnsi" w:cstheme="majorBidi"/>
+      <w:color w:val="0E2841" w:themeColor="text2"/>
+      <w:spacing w:val="-6"/>
+      <w:sz w:val="32"/>
+      <w:szCs w:val="32"/>
     </w:rPr>
   </w:style>
   <w:style w:type="character" w:styleId="IntenseReference">
@@ -1034,14 +1985,138 @@
     <w:basedOn w:val="DefaultParagraphFont"/>
     <w:uiPriority w:val="32"/>
     <w:qFormat/>
-    <w:rsid w:val="003A58E8"/>
+    <w:rsid w:val="006B1E90"/>
     <w:rPr>
       <w:b/>
       <w:bCs/>
       <w:smallCaps/>
-      <w:color w:val="0F4761" w:themeColor="accent1" w:themeShade="BF"/>
-      <w:spacing w:val="5"/>
-    </w:rPr>
+      <w:color w:val="0E2841" w:themeColor="text2"/>
+      <w:u w:val="single"/>
+    </w:rPr>
+  </w:style>
+  <w:style w:type="character" w:styleId="Hyperlink">
+    <w:name w:val="Hyperlink"/>
+    <w:basedOn w:val="DefaultParagraphFont"/>
+    <w:uiPriority w:val="99"/>
+    <w:unhideWhenUsed/>
+    <w:rsid w:val="00D90192"/>
+    <w:rPr>
+      <w:color w:val="467886" w:themeColor="hyperlink"/>
+      <w:u w:val="single"/>
+    </w:rPr>
+  </w:style>
+  <w:style w:type="character" w:styleId="UnresolvedMention">
+    <w:name w:val="Unresolved Mention"/>
+    <w:basedOn w:val="DefaultParagraphFont"/>
+    <w:uiPriority w:val="99"/>
+    <w:semiHidden/>
+    <w:unhideWhenUsed/>
+    <w:rsid w:val="00D90192"/>
+    <w:rPr>
+      <w:color w:val="605E5C"/>
+      <w:shd w:val="clear" w:color="auto" w:fill="E1DFDD"/>
+    </w:rPr>
+  </w:style>
+  <w:style w:type="paragraph" w:styleId="Caption">
+    <w:name w:val="caption"/>
+    <w:basedOn w:val="Normal"/>
+    <w:next w:val="Normal"/>
+    <w:uiPriority w:val="35"/>
+    <w:semiHidden/>
+    <w:unhideWhenUsed/>
+    <w:qFormat/>
+    <w:rsid w:val="006B1E90"/>
+    <w:pPr>
+      <w:spacing w:line="240" w:lineRule="auto"/>
+    </w:pPr>
+    <w:rPr>
+      <w:b/>
+      <w:bCs/>
+      <w:smallCaps/>
+      <w:color w:val="0E2841" w:themeColor="text2"/>
+    </w:rPr>
+  </w:style>
+  <w:style w:type="character" w:styleId="Strong">
+    <w:name w:val="Strong"/>
+    <w:basedOn w:val="DefaultParagraphFont"/>
+    <w:uiPriority w:val="22"/>
+    <w:qFormat/>
+    <w:rsid w:val="006B1E90"/>
+    <w:rPr>
+      <w:b/>
+      <w:bCs/>
+    </w:rPr>
+  </w:style>
+  <w:style w:type="character" w:styleId="Emphasis">
+    <w:name w:val="Emphasis"/>
+    <w:basedOn w:val="DefaultParagraphFont"/>
+    <w:uiPriority w:val="20"/>
+    <w:qFormat/>
+    <w:rsid w:val="006B1E90"/>
+    <w:rPr>
+      <w:i/>
+      <w:iCs/>
+    </w:rPr>
+  </w:style>
+  <w:style w:type="paragraph" w:styleId="NoSpacing">
+    <w:name w:val="No Spacing"/>
+    <w:uiPriority w:val="1"/>
+    <w:qFormat/>
+    <w:rsid w:val="006B1E90"/>
+    <w:pPr>
+      <w:spacing w:after="0" w:line="240" w:lineRule="auto"/>
+    </w:pPr>
+  </w:style>
+  <w:style w:type="character" w:styleId="SubtleEmphasis">
+    <w:name w:val="Subtle Emphasis"/>
+    <w:basedOn w:val="DefaultParagraphFont"/>
+    <w:uiPriority w:val="19"/>
+    <w:qFormat/>
+    <w:rsid w:val="006B1E90"/>
+    <w:rPr>
+      <w:i/>
+      <w:iCs/>
+      <w:color w:val="595959" w:themeColor="text1" w:themeTint="A6"/>
+    </w:rPr>
+  </w:style>
+  <w:style w:type="character" w:styleId="SubtleReference">
+    <w:name w:val="Subtle Reference"/>
+    <w:basedOn w:val="DefaultParagraphFont"/>
+    <w:uiPriority w:val="31"/>
+    <w:qFormat/>
+    <w:rsid w:val="006B1E90"/>
+    <w:rPr>
+      <w:smallCaps/>
+      <w:color w:val="595959" w:themeColor="text1" w:themeTint="A6"/>
+      <w:u w:val="none" w:color="7F7F7F" w:themeColor="text1" w:themeTint="80"/>
+      <w:bdr w:val="none" w:sz="0" w:space="0" w:color="auto"/>
+    </w:rPr>
+  </w:style>
+  <w:style w:type="character" w:styleId="BookTitle">
+    <w:name w:val="Book Title"/>
+    <w:basedOn w:val="DefaultParagraphFont"/>
+    <w:uiPriority w:val="33"/>
+    <w:qFormat/>
+    <w:rsid w:val="006B1E90"/>
+    <w:rPr>
+      <w:b/>
+      <w:bCs/>
+      <w:smallCaps/>
+      <w:spacing w:val="10"/>
+    </w:rPr>
+  </w:style>
+  <w:style w:type="paragraph" w:styleId="TOCHeading">
+    <w:name w:val="TOC Heading"/>
+    <w:basedOn w:val="Heading1"/>
+    <w:next w:val="Normal"/>
+    <w:uiPriority w:val="39"/>
+    <w:semiHidden/>
+    <w:unhideWhenUsed/>
+    <w:qFormat/>
+    <w:rsid w:val="006B1E90"/>
+    <w:pPr>
+      <w:outlineLvl w:val="9"/>
+    </w:pPr>
   </w:style>
 </w:styles>
 </file>

</xml_diff>